<commit_message>
Update Documento de Supuestos - Liga BetPlay.docx
</commit_message>
<xml_diff>
--- a/Documento de Supuestos - Liga BetPlay.docx
+++ b/Documento de Supuestos - Liga BetPlay.docx
@@ -23,8 +23,126 @@
           <w:b/>
           <w:sz w:val="28"/>
         </w:rPr>
-        <w:t>Sistema de Gestión de Información para la Liga BetPlay de Fútbol Profesional Colombiano</w:t>
-      </w:r>
+        <w:t xml:space="preserve">Sistema de </w:t>
+      </w:r>
+      <w:proofErr w:type="spellStart"/>
+      <w:r>
+        <w:rPr>
+          <w:rFonts w:asciiTheme="majorHAnsi" w:hAnsiTheme="majorHAnsi" w:cstheme="majorHAnsi"/>
+          <w:b/>
+          <w:sz w:val="28"/>
+        </w:rPr>
+        <w:t>Gestión</w:t>
+      </w:r>
+      <w:proofErr w:type="spellEnd"/>
+      <w:r>
+        <w:rPr>
+          <w:rFonts w:asciiTheme="majorHAnsi" w:hAnsiTheme="majorHAnsi" w:cstheme="majorHAnsi"/>
+          <w:b/>
+          <w:sz w:val="28"/>
+        </w:rPr>
+        <w:t xml:space="preserve"> de </w:t>
+      </w:r>
+      <w:proofErr w:type="spellStart"/>
+      <w:r>
+        <w:rPr>
+          <w:rFonts w:asciiTheme="majorHAnsi" w:hAnsiTheme="majorHAnsi" w:cstheme="majorHAnsi"/>
+          <w:b/>
+          <w:sz w:val="28"/>
+        </w:rPr>
+        <w:t>Información</w:t>
+      </w:r>
+      <w:proofErr w:type="spellEnd"/>
+      <w:r>
+        <w:rPr>
+          <w:rFonts w:asciiTheme="majorHAnsi" w:hAnsiTheme="majorHAnsi" w:cstheme="majorHAnsi"/>
+          <w:b/>
+          <w:sz w:val="28"/>
+        </w:rPr>
+        <w:t xml:space="preserve"> para la </w:t>
+      </w:r>
+      <w:proofErr w:type="spellStart"/>
+      <w:r>
+        <w:rPr>
+          <w:rFonts w:asciiTheme="majorHAnsi" w:hAnsiTheme="majorHAnsi" w:cstheme="majorHAnsi"/>
+          <w:b/>
+          <w:sz w:val="28"/>
+        </w:rPr>
+        <w:t>Liga</w:t>
+      </w:r>
+      <w:proofErr w:type="spellEnd"/>
+      <w:r>
+        <w:rPr>
+          <w:rFonts w:asciiTheme="majorHAnsi" w:hAnsiTheme="majorHAnsi" w:cstheme="majorHAnsi"/>
+          <w:b/>
+          <w:sz w:val="28"/>
+        </w:rPr>
+        <w:t xml:space="preserve"> </w:t>
+      </w:r>
+      <w:proofErr w:type="spellStart"/>
+      <w:r>
+        <w:rPr>
+          <w:rFonts w:asciiTheme="majorHAnsi" w:hAnsiTheme="majorHAnsi" w:cstheme="majorHAnsi"/>
+          <w:b/>
+          <w:sz w:val="28"/>
+        </w:rPr>
+        <w:t>BetPlay</w:t>
+      </w:r>
+      <w:proofErr w:type="spellEnd"/>
+      <w:r>
+        <w:rPr>
+          <w:rFonts w:asciiTheme="majorHAnsi" w:hAnsiTheme="majorHAnsi" w:cstheme="majorHAnsi"/>
+          <w:b/>
+          <w:sz w:val="28"/>
+        </w:rPr>
+        <w:t xml:space="preserve"> de </w:t>
+      </w:r>
+      <w:proofErr w:type="spellStart"/>
+      <w:r>
+        <w:rPr>
+          <w:rFonts w:asciiTheme="majorHAnsi" w:hAnsiTheme="majorHAnsi" w:cstheme="majorHAnsi"/>
+          <w:b/>
+          <w:sz w:val="28"/>
+        </w:rPr>
+        <w:t>Fútbol</w:t>
+      </w:r>
+      <w:proofErr w:type="spellEnd"/>
+      <w:r>
+        <w:rPr>
+          <w:rFonts w:asciiTheme="majorHAnsi" w:hAnsiTheme="majorHAnsi" w:cstheme="majorHAnsi"/>
+          <w:b/>
+          <w:sz w:val="28"/>
+        </w:rPr>
+        <w:t xml:space="preserve"> </w:t>
+      </w:r>
+      <w:proofErr w:type="spellStart"/>
+      <w:r>
+        <w:rPr>
+          <w:rFonts w:asciiTheme="majorHAnsi" w:hAnsiTheme="majorHAnsi" w:cstheme="majorHAnsi"/>
+          <w:b/>
+          <w:sz w:val="28"/>
+        </w:rPr>
+        <w:t>Profesional</w:t>
+      </w:r>
+      <w:proofErr w:type="spellEnd"/>
+      <w:r>
+        <w:rPr>
+          <w:rFonts w:asciiTheme="majorHAnsi" w:hAnsiTheme="majorHAnsi" w:cstheme="majorHAnsi"/>
+          <w:b/>
+          <w:sz w:val="28"/>
+        </w:rPr>
+        <w:t xml:space="preserve"> </w:t>
+      </w:r>
+      <w:proofErr w:type="spellStart"/>
+      <w:r>
+        <w:rPr>
+          <w:rFonts w:asciiTheme="majorHAnsi" w:hAnsiTheme="majorHAnsi" w:cstheme="majorHAnsi"/>
+          <w:b/>
+          <w:sz w:val="28"/>
+        </w:rPr>
+        <w:t>Colombiano</w:t>
+      </w:r>
+      <w:proofErr w:type="spellEnd"/>
     </w:p>
     <w:p>
       <w:pPr>
@@ -85,28 +203,87 @@
           <w:rFonts w:asciiTheme="majorHAnsi" w:hAnsiTheme="majorHAnsi" w:cstheme="majorHAnsi"/>
         </w:rPr>
       </w:pPr>
+      <w:proofErr w:type="spellStart"/>
       <w:r>
         <w:rPr>
           <w:rFonts w:asciiTheme="majorHAnsi" w:hAnsiTheme="majorHAnsi" w:cstheme="majorHAnsi"/>
           <w:sz w:val="24"/>
         </w:rPr>
-        <w:t>Asignatura: Bases de Datos 1</w:t>
-      </w:r>
-    </w:p>
-    <w:p>
-      <w:pPr>
-        <w:jc w:val="center"/>
-        <w:rPr>
-          <w:rFonts w:asciiTheme="majorHAnsi" w:hAnsiTheme="majorHAnsi" w:cstheme="majorHAnsi"/>
-        </w:rPr>
-      </w:pPr>
+        <w:t>Asignatura</w:t>
+      </w:r>
+      <w:proofErr w:type="spellEnd"/>
       <w:r>
         <w:rPr>
           <w:rFonts w:asciiTheme="majorHAnsi" w:hAnsiTheme="majorHAnsi" w:cstheme="majorHAnsi"/>
           <w:sz w:val="24"/>
         </w:rPr>
-        <w:t>Programa de Ingeniería de Sistemas</w:t>
-      </w:r>
+        <w:t xml:space="preserve">: Bases de </w:t>
+      </w:r>
+      <w:proofErr w:type="spellStart"/>
+      <w:r>
+        <w:rPr>
+          <w:rFonts w:asciiTheme="majorHAnsi" w:hAnsiTheme="majorHAnsi" w:cstheme="majorHAnsi"/>
+          <w:sz w:val="24"/>
+        </w:rPr>
+        <w:t>Datos</w:t>
+      </w:r>
+      <w:proofErr w:type="spellEnd"/>
+      <w:r>
+        <w:rPr>
+          <w:rFonts w:asciiTheme="majorHAnsi" w:hAnsiTheme="majorHAnsi" w:cstheme="majorHAnsi"/>
+          <w:sz w:val="24"/>
+        </w:rPr>
+        <w:t xml:space="preserve"> 1</w:t>
+      </w:r>
+    </w:p>
+    <w:p>
+      <w:pPr>
+        <w:jc w:val="center"/>
+        <w:rPr>
+          <w:rFonts w:asciiTheme="majorHAnsi" w:hAnsiTheme="majorHAnsi" w:cstheme="majorHAnsi"/>
+        </w:rPr>
+      </w:pPr>
+      <w:proofErr w:type="spellStart"/>
+      <w:r>
+        <w:rPr>
+          <w:rFonts w:asciiTheme="majorHAnsi" w:hAnsiTheme="majorHAnsi" w:cstheme="majorHAnsi"/>
+          <w:sz w:val="24"/>
+        </w:rPr>
+        <w:t>Programa</w:t>
+      </w:r>
+      <w:proofErr w:type="spellEnd"/>
+      <w:r>
+        <w:rPr>
+          <w:rFonts w:asciiTheme="majorHAnsi" w:hAnsiTheme="majorHAnsi" w:cstheme="majorHAnsi"/>
+          <w:sz w:val="24"/>
+        </w:rPr>
+        <w:t xml:space="preserve"> de </w:t>
+      </w:r>
+      <w:proofErr w:type="spellStart"/>
+      <w:r>
+        <w:rPr>
+          <w:rFonts w:asciiTheme="majorHAnsi" w:hAnsiTheme="majorHAnsi" w:cstheme="majorHAnsi"/>
+          <w:sz w:val="24"/>
+        </w:rPr>
+        <w:t>Ingeniería</w:t>
+      </w:r>
+      <w:proofErr w:type="spellEnd"/>
+      <w:r>
+        <w:rPr>
+          <w:rFonts w:asciiTheme="majorHAnsi" w:hAnsiTheme="majorHAnsi" w:cstheme="majorHAnsi"/>
+          <w:sz w:val="24"/>
+        </w:rPr>
+        <w:t xml:space="preserve"> de </w:t>
+      </w:r>
+      <w:proofErr w:type="spellStart"/>
+      <w:r>
+        <w:rPr>
+          <w:rFonts w:asciiTheme="majorHAnsi" w:hAnsiTheme="majorHAnsi" w:cstheme="majorHAnsi"/>
+          <w:sz w:val="24"/>
+        </w:rPr>
+        <w:t>Sistemas</w:t>
+      </w:r>
+      <w:proofErr w:type="spellEnd"/>
     </w:p>
     <w:p>
       <w:pPr>
@@ -165,12 +342,42 @@
           <w:rFonts w:asciiTheme="majorHAnsi" w:hAnsiTheme="majorHAnsi" w:cstheme="majorHAnsi"/>
         </w:rPr>
       </w:pPr>
+      <w:proofErr w:type="spellStart"/>
       <w:r>
         <w:rPr>
           <w:rFonts w:asciiTheme="majorHAnsi" w:hAnsiTheme="majorHAnsi" w:cstheme="majorHAnsi"/>
         </w:rPr>
-        <w:t>Fase 1 – Documento de Supuestos</w:t>
-      </w:r>
+        <w:t>Fase</w:t>
+      </w:r>
+      <w:proofErr w:type="spellEnd"/>
+      <w:r>
+        <w:rPr>
+          <w:rFonts w:asciiTheme="majorHAnsi" w:hAnsiTheme="majorHAnsi" w:cstheme="majorHAnsi"/>
+        </w:rPr>
+        <w:t xml:space="preserve"> 1 – </w:t>
+      </w:r>
+      <w:proofErr w:type="spellStart"/>
+      <w:r>
+        <w:rPr>
+          <w:rFonts w:asciiTheme="majorHAnsi" w:hAnsiTheme="majorHAnsi" w:cstheme="majorHAnsi"/>
+        </w:rPr>
+        <w:t>Documento</w:t>
+      </w:r>
+      <w:proofErr w:type="spellEnd"/>
+      <w:r>
+        <w:rPr>
+          <w:rFonts w:asciiTheme="majorHAnsi" w:hAnsiTheme="majorHAnsi" w:cstheme="majorHAnsi"/>
+        </w:rPr>
+        <w:t xml:space="preserve"> de </w:t>
+      </w:r>
+      <w:proofErr w:type="spellStart"/>
+      <w:r>
+        <w:rPr>
+          <w:rFonts w:asciiTheme="majorHAnsi" w:hAnsiTheme="majorHAnsi" w:cstheme="majorHAnsi"/>
+        </w:rPr>
+        <w:t>Supuestos</w:t>
+      </w:r>
+      <w:proofErr w:type="spellEnd"/>
     </w:p>
     <w:p>
       <w:pPr>
@@ -179,11 +386,33 @@
           <w:rFonts w:asciiTheme="majorHAnsi" w:hAnsiTheme="majorHAnsi" w:cstheme="majorHAnsi"/>
         </w:rPr>
       </w:pPr>
+      <w:proofErr w:type="spellStart"/>
       <w:r>
         <w:rPr>
           <w:rFonts w:asciiTheme="majorHAnsi" w:hAnsiTheme="majorHAnsi" w:cstheme="majorHAnsi"/>
         </w:rPr>
-        <w:t>Integrantes: Felipe Sierra, Samuel Cubillos, Antoine Blanco</w:t>
+        <w:t>Integrantes</w:t>
+      </w:r>
+      <w:proofErr w:type="spellEnd"/>
+      <w:r>
+        <w:rPr>
+          <w:rFonts w:asciiTheme="majorHAnsi" w:hAnsiTheme="majorHAnsi" w:cstheme="majorHAnsi"/>
+        </w:rPr>
+        <w:t xml:space="preserve">: Felipe Sierra, Samuel </w:t>
+      </w:r>
+      <w:proofErr w:type="spellStart"/>
+      <w:r>
+        <w:rPr>
+          <w:rFonts w:asciiTheme="majorHAnsi" w:hAnsiTheme="majorHAnsi" w:cstheme="majorHAnsi"/>
+        </w:rPr>
+        <w:t>Cubillos</w:t>
+      </w:r>
+      <w:proofErr w:type="spellEnd"/>
+      <w:r>
+        <w:rPr>
+          <w:rFonts w:asciiTheme="majorHAnsi" w:hAnsiTheme="majorHAnsi" w:cstheme="majorHAnsi"/>
+        </w:rPr>
+        <w:t>, Antoine Blanco</w:t>
       </w:r>
     </w:p>
     <w:p>
@@ -193,18 +422,34 @@
           <w:rFonts w:asciiTheme="majorHAnsi" w:hAnsiTheme="majorHAnsi" w:cstheme="majorHAnsi"/>
         </w:rPr>
       </w:pPr>
+      <w:proofErr w:type="spellStart"/>
       <w:r>
         <w:rPr>
           <w:rFonts w:asciiTheme="majorHAnsi" w:hAnsiTheme="majorHAnsi" w:cstheme="majorHAnsi"/>
         </w:rPr>
-        <w:t xml:space="preserve">Docente: </w:t>
-      </w:r>
+        <w:t>Docente</w:t>
+      </w:r>
+      <w:proofErr w:type="spellEnd"/>
+      <w:r>
+        <w:rPr>
+          <w:rFonts w:asciiTheme="majorHAnsi" w:hAnsiTheme="majorHAnsi" w:cstheme="majorHAnsi"/>
+        </w:rPr>
+        <w:t xml:space="preserve">: </w:t>
+      </w:r>
+      <w:proofErr w:type="spellStart"/>
       <w:proofErr w:type="gramStart"/>
       <w:r>
         <w:rPr>
           <w:rFonts w:asciiTheme="majorHAnsi" w:hAnsiTheme="majorHAnsi" w:cstheme="majorHAnsi"/>
         </w:rPr>
-        <w:t>Ing.,</w:t>
+        <w:t>Ing</w:t>
+      </w:r>
+      <w:proofErr w:type="spellEnd"/>
+      <w:r>
+        <w:rPr>
+          <w:rFonts w:asciiTheme="majorHAnsi" w:hAnsiTheme="majorHAnsi" w:cstheme="majorHAnsi"/>
+        </w:rPr>
+        <w:t>.,</w:t>
       </w:r>
       <w:proofErr w:type="gramEnd"/>
       <w:r>
@@ -386,7 +631,49 @@
         <w:rPr>
           <w:lang w:val="es-CO"/>
         </w:rPr>
-        <w:t>Este documento recoge los supuestos, las interpretaciones y las reglas de negocio que el equipo adoptó para construir el Modelo Entidad-Relación (MER) con notación Peter Chen, el MER Extendido y, a partir de ellos, el modelo relacional del sistema de información de la Liga BetPlay. Cada entidad, atributo y relación del diagrama se describe de forma textual, junto con su cardinalidad y su participación, de modo que el diagrama pueda leerse sin ambigüedad.</w:t>
+        <w:t xml:space="preserve">Este documento recoge los supuestos, las interpretaciones y las reglas de negocio que el equipo adoptó para construir el Modelo Entidad-Relación (MER) con notación Peter </w:t>
+      </w:r>
+      <w:proofErr w:type="spellStart"/>
+      <w:r>
+        <w:rPr>
+          <w:lang w:val="es-CO"/>
+        </w:rPr>
+        <w:t>Chen</w:t>
+      </w:r>
+      <w:proofErr w:type="spellEnd"/>
+      <w:r>
+        <w:rPr>
+          <w:lang w:val="es-CO"/>
+        </w:rPr>
+        <w:t xml:space="preserve">, el MER Extendido y, a partir de ellos, el modelo relacional del sistema de información de la Liga </w:t>
+      </w:r>
+      <w:proofErr w:type="spellStart"/>
+      <w:r>
+        <w:rPr>
+          <w:lang w:val="es-CO"/>
+        </w:rPr>
+        <w:t>BetPlay</w:t>
+      </w:r>
+      <w:proofErr w:type="spellEnd"/>
+      <w:r>
+        <w:rPr>
+          <w:lang w:val="es-CO"/>
+        </w:rPr>
+        <w:t xml:space="preserve">. Cada entidad, atributo y relación del diagrama se describe de forma textual, junto con su </w:t>
+      </w:r>
+      <w:proofErr w:type="spellStart"/>
+      <w:r>
+        <w:rPr>
+          <w:lang w:val="es-CO"/>
+        </w:rPr>
+        <w:t>cardinalidad</w:t>
+      </w:r>
+      <w:proofErr w:type="spellEnd"/>
+      <w:r>
+        <w:rPr>
+          <w:lang w:val="es-CO"/>
+        </w:rPr>
+        <w:t xml:space="preserve"> y su participación, de modo que el diagrama pueda leerse sin ambigüedad.</w:t>
       </w:r>
     </w:p>
     <w:p>
@@ -429,14 +716,50 @@
           <w:color w:val="000000"/>
           <w:lang w:val="es-CO"/>
         </w:rPr>
-        <w:t>MER normal (Chen):</w:t>
-      </w:r>
-      <w:r>
-        <w:rPr>
-          <w:color w:val="000000"/>
-          <w:lang w:val="es-CO"/>
-        </w:rPr>
-        <w:t xml:space="preserve"> entidades, atributos (simples, compuestos, multivaluados y derivados), entidades débiles y relaciones binarias y ternarias. No incluye especialización ni agregación.</w:t>
+        <w:t>MER normal (</w:t>
+      </w:r>
+      <w:proofErr w:type="spellStart"/>
+      <w:r>
+        <w:rPr>
+          <w:b/>
+          <w:bCs/>
+          <w:color w:val="000000"/>
+          <w:lang w:val="es-CO"/>
+        </w:rPr>
+        <w:t>Chen</w:t>
+      </w:r>
+      <w:proofErr w:type="spellEnd"/>
+      <w:r>
+        <w:rPr>
+          <w:b/>
+          <w:bCs/>
+          <w:color w:val="000000"/>
+          <w:lang w:val="es-CO"/>
+        </w:rPr>
+        <w:t>):</w:t>
+      </w:r>
+      <w:r>
+        <w:rPr>
+          <w:color w:val="000000"/>
+          <w:lang w:val="es-CO"/>
+        </w:rPr>
+        <w:t xml:space="preserve"> entidades, atributos (simples, compuestos, </w:t>
+      </w:r>
+      <w:proofErr w:type="spellStart"/>
+      <w:r>
+        <w:rPr>
+          <w:color w:val="000000"/>
+          <w:lang w:val="es-CO"/>
+        </w:rPr>
+        <w:t>multivaluados</w:t>
+      </w:r>
+      <w:proofErr w:type="spellEnd"/>
+      <w:r>
+        <w:rPr>
+          <w:color w:val="000000"/>
+          <w:lang w:val="es-CO"/>
+        </w:rPr>
+        <w:t xml:space="preserve"> y derivados), entidades débiles y relaciones binarias y ternarias. No incluye especialización ni agregación.</w:t>
       </w:r>
     </w:p>
     <w:p>
@@ -562,7 +885,23 @@
           <w:color w:val="000000"/>
           <w:lang w:val="es-CO"/>
         </w:rPr>
-        <w:t xml:space="preserve"> de una única organización responsable de administrar la Liga BetPlay. No se integran otras ligas, países ni fuentes externas.</w:t>
+        <w:t xml:space="preserve"> de una única organización responsable de administrar la Liga </w:t>
+      </w:r>
+      <w:proofErr w:type="spellStart"/>
+      <w:r>
+        <w:rPr>
+          <w:color w:val="000000"/>
+          <w:lang w:val="es-CO"/>
+        </w:rPr>
+        <w:t>BetPlay</w:t>
+      </w:r>
+      <w:proofErr w:type="spellEnd"/>
+      <w:r>
+        <w:rPr>
+          <w:color w:val="000000"/>
+          <w:lang w:val="es-CO"/>
+        </w:rPr>
+        <w:t>. No se integran otras ligas, países ni fuentes externas.</w:t>
       </w:r>
     </w:p>
     <w:p>
@@ -966,7 +1305,23 @@
           <w:color w:val="F27900"/>
           <w:lang w:val="es-CO"/>
         </w:rPr>
-        <w:t>3. Convenciones de notación (Peter Chen)</w:t>
+        <w:t xml:space="preserve">3. Convenciones de notación (Peter </w:t>
+      </w:r>
+      <w:proofErr w:type="spellStart"/>
+      <w:r>
+        <w:rPr>
+          <w:color w:val="F27900"/>
+          <w:lang w:val="es-CO"/>
+        </w:rPr>
+        <w:t>Chen</w:t>
+      </w:r>
+      <w:proofErr w:type="spellEnd"/>
+      <w:r>
+        <w:rPr>
+          <w:color w:val="F27900"/>
+          <w:lang w:val="es-CO"/>
+        </w:rPr>
+        <w:t>)</w:t>
       </w:r>
     </w:p>
     <w:tbl>
@@ -1379,8 +1734,16 @@
               <w:rPr>
                 <w:lang w:val="es-CO"/>
               </w:rPr>
-              <w:t>Atributo multivaluado</w:t>
-            </w:r>
+              <w:t xml:space="preserve">Atributo </w:t>
+            </w:r>
+            <w:proofErr w:type="spellStart"/>
+            <w:r>
+              <w:rPr>
+                <w:lang w:val="es-CO"/>
+              </w:rPr>
+              <w:t>multivaluado</w:t>
+            </w:r>
+            <w:proofErr w:type="spellEnd"/>
           </w:p>
         </w:tc>
         <w:tc>
@@ -1476,7 +1839,21 @@
               <w:rPr>
                 <w:lang w:val="es-CO"/>
               </w:rPr>
-              <w:t>Se calcula a partir de otros (edad, Duracion_dias).</w:t>
+              <w:t xml:space="preserve">Se calcula a partir de otros (edad, </w:t>
+            </w:r>
+            <w:proofErr w:type="spellStart"/>
+            <w:r>
+              <w:rPr>
+                <w:lang w:val="es-CO"/>
+              </w:rPr>
+              <w:t>Duracion_dias</w:t>
+            </w:r>
+            <w:proofErr w:type="spellEnd"/>
+            <w:r>
+              <w:rPr>
+                <w:lang w:val="es-CO"/>
+              </w:rPr>
+              <w:t>).</w:t>
             </w:r>
           </w:p>
         </w:tc>
@@ -1611,12 +1988,14 @@
                 <w:lang w:val="es-CO"/>
               </w:rPr>
             </w:pPr>
+            <w:proofErr w:type="spellStart"/>
             <w:r>
               <w:rPr>
                 <w:lang w:val="es-CO"/>
               </w:rPr>
               <w:t>Cardinalidad</w:t>
             </w:r>
+            <w:proofErr w:type="spellEnd"/>
           </w:p>
         </w:tc>
         <w:tc>
@@ -1852,12 +2231,14 @@
                 <w:lang w:val="es-CO"/>
               </w:rPr>
             </w:pPr>
+            <w:proofErr w:type="spellStart"/>
             <w:r>
               <w:rPr>
                 <w:lang w:val="es-CO"/>
               </w:rPr>
               <w:t>id_tecnico</w:t>
             </w:r>
+            <w:proofErr w:type="spellEnd"/>
           </w:p>
         </w:tc>
         <w:tc>
@@ -2028,12 +2409,14 @@
                 <w:lang w:val="es-CO"/>
               </w:rPr>
             </w:pPr>
+            <w:proofErr w:type="spellStart"/>
             <w:r>
               <w:rPr>
                 <w:lang w:val="es-CO"/>
               </w:rPr>
               <w:t>fecha_nacimiento</w:t>
             </w:r>
+            <w:proofErr w:type="spellEnd"/>
           </w:p>
         </w:tc>
         <w:tc>
@@ -2229,12 +2612,14 @@
                 <w:lang w:val="es-CO"/>
               </w:rPr>
             </w:pPr>
+            <w:proofErr w:type="spellStart"/>
             <w:r>
               <w:rPr>
                 <w:lang w:val="es-CO"/>
               </w:rPr>
               <w:t>id_equipo</w:t>
             </w:r>
+            <w:proofErr w:type="spellEnd"/>
           </w:p>
         </w:tc>
         <w:tc>
@@ -2347,12 +2732,14 @@
                 <w:lang w:val="es-CO"/>
               </w:rPr>
             </w:pPr>
+            <w:proofErr w:type="spellStart"/>
             <w:r>
               <w:rPr>
                 <w:lang w:val="es-CO"/>
               </w:rPr>
               <w:t>fecha_fundacion</w:t>
             </w:r>
+            <w:proofErr w:type="spellEnd"/>
           </w:p>
         </w:tc>
         <w:tc>
@@ -2484,12 +2871,14 @@
                 <w:lang w:val="es-CO"/>
               </w:rPr>
             </w:pPr>
+            <w:proofErr w:type="spellStart"/>
             <w:r>
               <w:rPr>
                 <w:lang w:val="es-CO"/>
               </w:rPr>
               <w:t>Multivaluado</w:t>
             </w:r>
+            <w:proofErr w:type="spellEnd"/>
           </w:p>
         </w:tc>
         <w:tc>
@@ -2665,12 +3054,14 @@
                 <w:lang w:val="es-CO"/>
               </w:rPr>
             </w:pPr>
+            <w:proofErr w:type="spellStart"/>
             <w:r>
               <w:rPr>
                 <w:lang w:val="es-CO"/>
               </w:rPr>
               <w:t>id_estadio</w:t>
             </w:r>
+            <w:proofErr w:type="spellEnd"/>
           </w:p>
         </w:tc>
         <w:tc>
@@ -3042,12 +3433,14 @@
                 <w:lang w:val="es-CO"/>
               </w:rPr>
             </w:pPr>
+            <w:proofErr w:type="spellStart"/>
             <w:r>
               <w:rPr>
                 <w:lang w:val="es-CO"/>
               </w:rPr>
               <w:t>id_torneo</w:t>
             </w:r>
+            <w:proofErr w:type="spellEnd"/>
           </w:p>
         </w:tc>
         <w:tc>
@@ -3278,6 +3671,7 @@
                 <w:lang w:val="es-CO"/>
               </w:rPr>
             </w:pPr>
+            <w:proofErr w:type="spellStart"/>
             <w:r>
               <w:rPr>
                 <w:lang w:val="es-CO"/>
@@ -3285,6 +3679,7 @@
               <w:lastRenderedPageBreak/>
               <w:t>Fecha_inicio</w:t>
             </w:r>
+            <w:proofErr w:type="spellEnd"/>
           </w:p>
         </w:tc>
         <w:tc>
@@ -3338,12 +3733,14 @@
                 <w:lang w:val="es-CO"/>
               </w:rPr>
             </w:pPr>
+            <w:proofErr w:type="spellStart"/>
             <w:r>
               <w:rPr>
                 <w:lang w:val="es-CO"/>
               </w:rPr>
               <w:t>Fecha_fin</w:t>
             </w:r>
+            <w:proofErr w:type="spellEnd"/>
           </w:p>
         </w:tc>
         <w:tc>
@@ -3397,12 +3794,14 @@
                 <w:lang w:val="es-CO"/>
               </w:rPr>
             </w:pPr>
+            <w:proofErr w:type="spellStart"/>
             <w:r>
               <w:rPr>
                 <w:lang w:val="es-CO"/>
               </w:rPr>
               <w:t>Duracion_dias</w:t>
             </w:r>
+            <w:proofErr w:type="spellEnd"/>
           </w:p>
         </w:tc>
         <w:tc>
@@ -3439,7 +3838,35 @@
               <w:rPr>
                 <w:lang w:val="es-CO"/>
               </w:rPr>
-              <w:t>Se calcula como Fecha_fin − Fecha_inicio.</w:t>
+              <w:t xml:space="preserve">Se calcula como </w:t>
+            </w:r>
+            <w:proofErr w:type="spellStart"/>
+            <w:r>
+              <w:rPr>
+                <w:lang w:val="es-CO"/>
+              </w:rPr>
+              <w:t>Fecha_fin</w:t>
+            </w:r>
+            <w:proofErr w:type="spellEnd"/>
+            <w:r>
+              <w:rPr>
+                <w:lang w:val="es-CO"/>
+              </w:rPr>
+              <w:t xml:space="preserve"> − </w:t>
+            </w:r>
+            <w:proofErr w:type="spellStart"/>
+            <w:r>
+              <w:rPr>
+                <w:lang w:val="es-CO"/>
+              </w:rPr>
+              <w:t>Fecha_inicio</w:t>
+            </w:r>
+            <w:proofErr w:type="spellEnd"/>
+            <w:r>
+              <w:rPr>
+                <w:lang w:val="es-CO"/>
+              </w:rPr>
+              <w:t>.</w:t>
             </w:r>
           </w:p>
         </w:tc>
@@ -3609,12 +4036,14 @@
                 <w:lang w:val="es-CO"/>
               </w:rPr>
             </w:pPr>
+            <w:proofErr w:type="spellStart"/>
             <w:r>
               <w:rPr>
                 <w:lang w:val="es-CO"/>
               </w:rPr>
               <w:t>id_partido</w:t>
             </w:r>
+            <w:proofErr w:type="spellEnd"/>
           </w:p>
         </w:tc>
         <w:tc>
@@ -3986,12 +4415,14 @@
                 <w:lang w:val="es-CO"/>
               </w:rPr>
             </w:pPr>
+            <w:proofErr w:type="spellStart"/>
             <w:r>
               <w:rPr>
                 <w:lang w:val="es-CO"/>
               </w:rPr>
               <w:t>id_resultado</w:t>
             </w:r>
+            <w:proofErr w:type="spellEnd"/>
           </w:p>
         </w:tc>
         <w:tc>
@@ -4045,12 +4476,14 @@
                 <w:lang w:val="es-CO"/>
               </w:rPr>
             </w:pPr>
+            <w:proofErr w:type="spellStart"/>
             <w:r>
               <w:rPr>
                 <w:lang w:val="es-CO"/>
               </w:rPr>
               <w:t>goles_local</w:t>
             </w:r>
+            <w:proofErr w:type="spellEnd"/>
           </w:p>
         </w:tc>
         <w:tc>
@@ -4104,12 +4537,14 @@
                 <w:lang w:val="es-CO"/>
               </w:rPr>
             </w:pPr>
+            <w:proofErr w:type="spellStart"/>
             <w:r>
               <w:rPr>
                 <w:lang w:val="es-CO"/>
               </w:rPr>
               <w:t>goles_visitante</w:t>
             </w:r>
+            <w:proofErr w:type="spellEnd"/>
           </w:p>
         </w:tc>
         <w:tc>
@@ -4482,12 +4917,14 @@
                 <w:lang w:val="es-CO"/>
               </w:rPr>
             </w:pPr>
+            <w:proofErr w:type="spellStart"/>
             <w:r>
               <w:rPr>
                 <w:lang w:val="es-CO"/>
               </w:rPr>
               <w:t>Categoria</w:t>
             </w:r>
+            <w:proofErr w:type="spellEnd"/>
           </w:p>
         </w:tc>
         <w:tc>
@@ -4682,12 +5119,14 @@
                 <w:lang w:val="es-CO"/>
               </w:rPr>
             </w:pPr>
+            <w:proofErr w:type="spellStart"/>
             <w:r>
               <w:rPr>
                 <w:lang w:val="es-CO"/>
               </w:rPr>
               <w:t>id_jugador</w:t>
             </w:r>
+            <w:proofErr w:type="spellEnd"/>
           </w:p>
         </w:tc>
         <w:tc>
@@ -4859,12 +5298,14 @@
                 <w:lang w:val="es-CO"/>
               </w:rPr>
             </w:pPr>
+            <w:proofErr w:type="spellStart"/>
             <w:r>
               <w:rPr>
                 <w:lang w:val="es-CO"/>
               </w:rPr>
               <w:t>fecha_nacimiento</w:t>
             </w:r>
+            <w:proofErr w:type="spellEnd"/>
           </w:p>
         </w:tc>
         <w:tc>
@@ -4977,12 +5418,14 @@
                 <w:lang w:val="es-CO"/>
               </w:rPr>
             </w:pPr>
+            <w:proofErr w:type="spellStart"/>
             <w:r>
               <w:rPr>
                 <w:lang w:val="es-CO"/>
               </w:rPr>
               <w:t>Posicion</w:t>
             </w:r>
+            <w:proofErr w:type="spellEnd"/>
           </w:p>
         </w:tc>
         <w:tc>
@@ -5178,12 +5621,14 @@
                 <w:lang w:val="es-CO"/>
               </w:rPr>
             </w:pPr>
+            <w:proofErr w:type="spellStart"/>
             <w:r>
               <w:rPr>
                 <w:lang w:val="es-CO"/>
               </w:rPr>
               <w:t>id_participacion</w:t>
             </w:r>
+            <w:proofErr w:type="spellEnd"/>
           </w:p>
         </w:tc>
         <w:tc>
@@ -5296,12 +5741,14 @@
                 <w:lang w:val="es-CO"/>
               </w:rPr>
             </w:pPr>
+            <w:proofErr w:type="spellStart"/>
             <w:r>
               <w:rPr>
                 <w:lang w:val="es-CO"/>
               </w:rPr>
               <w:t>Minutos_jugados</w:t>
             </w:r>
+            <w:proofErr w:type="spellEnd"/>
           </w:p>
         </w:tc>
         <w:tc>
@@ -5493,12 +5940,14 @@
                 <w:lang w:val="es-CO"/>
               </w:rPr>
             </w:pPr>
+            <w:proofErr w:type="spellStart"/>
             <w:r>
               <w:rPr>
                 <w:lang w:val="es-CO"/>
               </w:rPr>
               <w:t>id_gol</w:t>
             </w:r>
+            <w:proofErr w:type="spellEnd"/>
           </w:p>
         </w:tc>
         <w:tc>
@@ -5811,12 +6260,14 @@
                 <w:lang w:val="es-CO"/>
               </w:rPr>
             </w:pPr>
+            <w:proofErr w:type="spellStart"/>
             <w:r>
               <w:rPr>
                 <w:lang w:val="es-CO"/>
               </w:rPr>
               <w:t>id_tarjeta</w:t>
             </w:r>
+            <w:proofErr w:type="spellEnd"/>
           </w:p>
         </w:tc>
         <w:tc>
@@ -6130,12 +6581,14 @@
                 <w:lang w:val="es-CO"/>
               </w:rPr>
             </w:pPr>
+            <w:proofErr w:type="spellStart"/>
             <w:r>
               <w:rPr>
                 <w:lang w:val="es-CO"/>
               </w:rPr>
               <w:t>id_tipo</w:t>
             </w:r>
+            <w:proofErr w:type="spellEnd"/>
           </w:p>
         </w:tc>
         <w:tc>
@@ -6263,7 +6716,23 @@
           <w:color w:val="F27900"/>
           <w:lang w:val="es-CO"/>
         </w:rPr>
-        <w:t>5. Relaciones y cardinalidades (MER normal)</w:t>
+        <w:t xml:space="preserve">5. Relaciones y </w:t>
+      </w:r>
+      <w:proofErr w:type="spellStart"/>
+      <w:r>
+        <w:rPr>
+          <w:color w:val="F27900"/>
+          <w:lang w:val="es-CO"/>
+        </w:rPr>
+        <w:t>cardinalidades</w:t>
+      </w:r>
+      <w:proofErr w:type="spellEnd"/>
+      <w:r>
+        <w:rPr>
+          <w:color w:val="F27900"/>
+          <w:lang w:val="es-CO"/>
+        </w:rPr>
+        <w:t xml:space="preserve"> (MER normal)</w:t>
       </w:r>
     </w:p>
     <w:p>
@@ -6395,6 +6864,7 @@
                 <w:lang w:val="es-CO"/>
               </w:rPr>
             </w:pPr>
+            <w:proofErr w:type="spellStart"/>
             <w:r>
               <w:rPr>
                 <w:b/>
@@ -6403,6 +6873,7 @@
               </w:rPr>
               <w:t>Cardinalidad</w:t>
             </w:r>
+            <w:proofErr w:type="spellEnd"/>
           </w:p>
         </w:tc>
         <w:tc>
@@ -6809,11 +7280,33 @@
                 <w:lang w:val="es-CO"/>
               </w:rPr>
             </w:pPr>
-            <w:r>
-              <w:rPr>
-                <w:lang w:val="es-CO"/>
-              </w:rPr>
-              <w:t>fecha_inicio, fecha_fin, dorsal</w:t>
+            <w:proofErr w:type="spellStart"/>
+            <w:r>
+              <w:rPr>
+                <w:lang w:val="es-CO"/>
+              </w:rPr>
+              <w:t>fecha_inicio</w:t>
+            </w:r>
+            <w:proofErr w:type="spellEnd"/>
+            <w:r>
+              <w:rPr>
+                <w:lang w:val="es-CO"/>
+              </w:rPr>
+              <w:t xml:space="preserve">, </w:t>
+            </w:r>
+            <w:proofErr w:type="spellStart"/>
+            <w:r>
+              <w:rPr>
+                <w:lang w:val="es-CO"/>
+              </w:rPr>
+              <w:t>fecha_fin</w:t>
+            </w:r>
+            <w:proofErr w:type="spellEnd"/>
+            <w:r>
+              <w:rPr>
+                <w:lang w:val="es-CO"/>
+              </w:rPr>
+              <w:t>, dorsal</w:t>
             </w:r>
           </w:p>
         </w:tc>
@@ -7146,6 +7639,12 @@
               </w:rPr>
               <w:t>JUGAR</w:t>
             </w:r>
+            <w:r>
+              <w:rPr>
+                <w:lang w:val="es-CO"/>
+              </w:rPr>
+              <w:t xml:space="preserve"> </w:t>
+            </w:r>
           </w:p>
         </w:tc>
         <w:tc>
@@ -7886,6 +8385,115 @@
           </w:p>
         </w:tc>
       </w:tr>
+      <w:tr>
+        <w:tc>
+          <w:tcPr>
+            <w:tcW w:w="1872" w:type="dxa"/>
+          </w:tcPr>
+          <w:p>
+            <w:pPr>
+              <w:jc w:val="both"/>
+              <w:rPr>
+                <w:lang w:val="es-CO"/>
+              </w:rPr>
+            </w:pPr>
+            <w:r>
+              <w:rPr>
+                <w:lang w:val="es-CO"/>
+              </w:rPr>
+              <w:t>16</w:t>
+            </w:r>
+          </w:p>
+        </w:tc>
+        <w:tc>
+          <w:tcPr>
+            <w:tcW w:w="1872" w:type="dxa"/>
+          </w:tcPr>
+          <w:p>
+            <w:pPr>
+              <w:jc w:val="both"/>
+              <w:rPr>
+                <w:lang w:val="es-CO"/>
+              </w:rPr>
+            </w:pPr>
+            <w:r>
+              <w:rPr>
+                <w:lang w:val="es-CO"/>
+              </w:rPr>
+              <w:t>JUGAR</w:t>
+            </w:r>
+          </w:p>
+        </w:tc>
+        <w:tc>
+          <w:tcPr>
+            <w:tcW w:w="1872" w:type="dxa"/>
+          </w:tcPr>
+          <w:p>
+            <w:pPr>
+              <w:jc w:val="both"/>
+              <w:rPr>
+                <w:lang w:val="es-CO"/>
+              </w:rPr>
+            </w:pPr>
+            <w:r>
+              <w:rPr>
+                <w:lang w:val="es-CO"/>
+              </w:rPr>
+              <w:t xml:space="preserve">PARTIDO </w:t>
+            </w:r>
+            <w:r>
+              <w:rPr>
+                <w:lang w:val="es-CO"/>
+              </w:rPr>
+              <w:t>—</w:t>
+            </w:r>
+            <w:r>
+              <w:rPr>
+                <w:lang w:val="es-CO"/>
+              </w:rPr>
+              <w:t>JUGADOR</w:t>
+            </w:r>
+          </w:p>
+        </w:tc>
+        <w:tc>
+          <w:tcPr>
+            <w:tcW w:w="1872" w:type="dxa"/>
+          </w:tcPr>
+          <w:p>
+            <w:pPr>
+              <w:jc w:val="both"/>
+              <w:rPr>
+                <w:lang w:val="es-CO"/>
+              </w:rPr>
+            </w:pPr>
+            <w:r>
+              <w:rPr>
+                <w:lang w:val="es-CO"/>
+              </w:rPr>
+              <w:t>M:M</w:t>
+            </w:r>
+          </w:p>
+        </w:tc>
+        <w:tc>
+          <w:tcPr>
+            <w:tcW w:w="1872" w:type="dxa"/>
+          </w:tcPr>
+          <w:p>
+            <w:pPr>
+              <w:jc w:val="both"/>
+              <w:rPr>
+                <w:lang w:val="es-CO"/>
+              </w:rPr>
+            </w:pPr>
+            <w:r>
+              <w:rPr>
+                <w:lang w:val="es-CO"/>
+              </w:rPr>
+              <w:t>—</w:t>
+            </w:r>
+          </w:p>
+        </w:tc>
+      </w:tr>
     </w:tbl>
     <w:p>
       <w:pPr>
@@ -8045,6 +8653,7 @@
         </w:rPr>
         <w:t xml:space="preserve"> Relación ternaria que registra que un jugador está inscrito en un equipo para un torneo. Un jugador puede inscribirse en varios equipos y torneos; un equipo inscribe a varios jugadores en cada torneo; y en un torneo se inscriben jugadores de muchos equipos. Atributos de la relación: </w:t>
       </w:r>
+      <w:proofErr w:type="spellStart"/>
       <w:r>
         <w:rPr>
           <w:rFonts w:ascii="Arial" w:eastAsia="Consolas" w:hAnsi="Arial" w:cs="Arial"/>
@@ -8055,6 +8664,7 @@
         </w:rPr>
         <w:t>fecha_inicio</w:t>
       </w:r>
+      <w:proofErr w:type="spellEnd"/>
       <w:r>
         <w:rPr>
           <w:rFonts w:ascii="Arial" w:hAnsi="Arial" w:cs="Arial"/>
@@ -8062,6 +8672,7 @@
         </w:rPr>
         <w:t xml:space="preserve"> y </w:t>
       </w:r>
+      <w:proofErr w:type="spellStart"/>
       <w:r>
         <w:rPr>
           <w:rFonts w:ascii="Arial" w:eastAsia="Consolas" w:hAnsi="Arial" w:cs="Arial"/>
@@ -8072,6 +8683,7 @@
         </w:rPr>
         <w:t>fecha_fin</w:t>
       </w:r>
+      <w:proofErr w:type="spellEnd"/>
       <w:r>
         <w:rPr>
           <w:lang w:val="es-CO"/>
@@ -8188,6 +8800,7 @@
           <w:bCs/>
           <w:lang w:val="es-CO"/>
         </w:rPr>
+        <w:lastRenderedPageBreak/>
         <w:t>7. SER_VISITANTE (EQUIPO 1</w:t>
       </w:r>
       <w:proofErr w:type="gramStart"/>
@@ -8228,7 +8841,6 @@
           <w:bCs/>
           <w:lang w:val="es-CO"/>
         </w:rPr>
-        <w:lastRenderedPageBreak/>
         <w:t>8. JUGAR (ESTADIO 1</w:t>
       </w:r>
       <w:proofErr w:type="gramStart"/>
@@ -8533,6 +9145,102 @@
         </w:rPr>
         <w:t xml:space="preserve"> Un tipo de tarjeta puede estar asociado a muchas tarjetas, y cada tarjeta es de un único tipo (amarilla o roja). Todo tipo de tarjeta puede no haberse usado aún.</w:t>
       </w:r>
+    </w:p>
+    <w:p>
+      <w:pPr>
+        <w:jc w:val="both"/>
+        <w:rPr>
+          <w:lang w:val="es-CO"/>
+        </w:rPr>
+      </w:pPr>
+      <w:r>
+        <w:rPr>
+          <w:b/>
+          <w:bCs/>
+          <w:lang w:val="es-CO"/>
+        </w:rPr>
+        <w:t>16</w:t>
+      </w:r>
+      <w:r>
+        <w:rPr>
+          <w:b/>
+          <w:bCs/>
+          <w:lang w:val="es-CO"/>
+        </w:rPr>
+        <w:t xml:space="preserve">. </w:t>
+      </w:r>
+      <w:r>
+        <w:rPr>
+          <w:b/>
+          <w:bCs/>
+          <w:lang w:val="es-CO"/>
+        </w:rPr>
+        <w:t>JUGAR</w:t>
+      </w:r>
+      <w:r>
+        <w:rPr>
+          <w:b/>
+          <w:bCs/>
+          <w:lang w:val="es-CO"/>
+        </w:rPr>
+        <w:t xml:space="preserve"> (</w:t>
+      </w:r>
+      <w:r>
+        <w:rPr>
+          <w:b/>
+          <w:bCs/>
+          <w:lang w:val="es-CO"/>
+        </w:rPr>
+        <w:t>JUGADOR M</w:t>
+      </w:r>
+      <w:proofErr w:type="gramStart"/>
+      <w:r>
+        <w:rPr>
+          <w:b/>
+          <w:bCs/>
+          <w:lang w:val="es-CO"/>
+        </w:rPr>
+        <w:t>:M</w:t>
+      </w:r>
+      <w:proofErr w:type="gramEnd"/>
+      <w:r>
+        <w:rPr>
+          <w:b/>
+          <w:bCs/>
+          <w:lang w:val="es-CO"/>
+        </w:rPr>
+        <w:t xml:space="preserve"> PARTIDO</w:t>
+      </w:r>
+      <w:r>
+        <w:rPr>
+          <w:b/>
+          <w:bCs/>
+          <w:lang w:val="es-CO"/>
+        </w:rPr>
+        <w:t>).</w:t>
+      </w:r>
+      <w:r>
+        <w:rPr>
+          <w:lang w:val="es-CO"/>
+        </w:rPr>
+        <w:t xml:space="preserve"> </w:t>
+      </w:r>
+      <w:r>
+        <w:rPr>
+          <w:lang w:val="es-CO"/>
+        </w:rPr>
+        <w:t>Muchos juegan muchos partidos, y muchos partidos son jugados por muchos jugadores.</w:t>
+      </w:r>
+      <w:bookmarkStart w:id="0" w:name="_GoBack"/>
+      <w:bookmarkEnd w:id="0"/>
+    </w:p>
+    <w:p>
+      <w:pPr>
+        <w:jc w:val="both"/>
+        <w:rPr>
+          <w:lang w:val="es-CO"/>
+        </w:rPr>
+      </w:pPr>
     </w:p>
     <w:p>
       <w:pPr>
@@ -8735,6 +9443,7 @@
           <w:color w:val="000000"/>
           <w:lang w:val="es-CO"/>
         </w:rPr>
+        <w:lastRenderedPageBreak/>
         <w:t>RN-05.</w:t>
       </w:r>
       <w:r>
@@ -8780,6 +9489,7 @@
         </w:rPr>
         <w:t xml:space="preserve"> El resultado de un partido solo existe cuando el partido fue disputado. La suma de </w:t>
       </w:r>
+      <w:proofErr w:type="spellStart"/>
       <w:r>
         <w:rPr>
           <w:rFonts w:ascii="Arial" w:eastAsia="Consolas" w:hAnsi="Arial" w:cs="Arial"/>
@@ -8791,6 +9501,7 @@
         </w:rPr>
         <w:t>goles_local</w:t>
       </w:r>
+      <w:proofErr w:type="spellEnd"/>
       <w:r>
         <w:rPr>
           <w:rFonts w:ascii="Arial" w:hAnsi="Arial" w:cs="Arial"/>
@@ -8799,6 +9510,7 @@
         </w:rPr>
         <w:t xml:space="preserve"> y </w:t>
       </w:r>
+      <w:proofErr w:type="spellStart"/>
       <w:r>
         <w:rPr>
           <w:rFonts w:ascii="Arial" w:eastAsia="Consolas" w:hAnsi="Arial" w:cs="Arial"/>
@@ -8810,6 +9522,7 @@
         </w:rPr>
         <w:t>goles_visitante</w:t>
       </w:r>
+      <w:proofErr w:type="spellEnd"/>
       <w:r>
         <w:rPr>
           <w:color w:val="000000"/>
@@ -8916,7 +9629,6 @@
           <w:color w:val="000000"/>
           <w:lang w:val="es-CO"/>
         </w:rPr>
-        <w:lastRenderedPageBreak/>
         <w:t>RN-09.</w:t>
       </w:r>
       <w:r>
@@ -9129,7 +9841,49 @@
         <w:rPr>
           <w:lang w:val="es-CO"/>
         </w:rPr>
-        <w:t>JUGADOR es la superclase. Se especializa según la posición en la que juega, y cada subclase hereda todos los atributos de JUGADOR (id_jugador, Nombre, Nacionalidad, fecha_nacimiento, edad y Posicion).</w:t>
+        <w:t>JUGADOR es la superclase. Se especializa según la posición en la que juega, y cada subclase hereda todos los atributos de JUGADOR (</w:t>
+      </w:r>
+      <w:proofErr w:type="spellStart"/>
+      <w:r>
+        <w:rPr>
+          <w:lang w:val="es-CO"/>
+        </w:rPr>
+        <w:t>id_jugador</w:t>
+      </w:r>
+      <w:proofErr w:type="spellEnd"/>
+      <w:r>
+        <w:rPr>
+          <w:lang w:val="es-CO"/>
+        </w:rPr>
+        <w:t xml:space="preserve">, Nombre, Nacionalidad, </w:t>
+      </w:r>
+      <w:proofErr w:type="spellStart"/>
+      <w:r>
+        <w:rPr>
+          <w:lang w:val="es-CO"/>
+        </w:rPr>
+        <w:t>fecha_nacimiento</w:t>
+      </w:r>
+      <w:proofErr w:type="spellEnd"/>
+      <w:r>
+        <w:rPr>
+          <w:lang w:val="es-CO"/>
+        </w:rPr>
+        <w:t xml:space="preserve">, edad y </w:t>
+      </w:r>
+      <w:proofErr w:type="spellStart"/>
+      <w:r>
+        <w:rPr>
+          <w:lang w:val="es-CO"/>
+        </w:rPr>
+        <w:t>Posicion</w:t>
+      </w:r>
+      <w:proofErr w:type="spellEnd"/>
+      <w:r>
+        <w:rPr>
+          <w:lang w:val="es-CO"/>
+        </w:rPr>
+        <w:t>).</w:t>
       </w:r>
     </w:p>
     <w:tbl>
@@ -9261,12 +10015,14 @@
                 <w:lang w:val="es-CO"/>
               </w:rPr>
             </w:pPr>
+            <w:proofErr w:type="spellStart"/>
             <w:r>
               <w:rPr>
                 <w:lang w:val="es-CO"/>
               </w:rPr>
               <w:t>Tiros_Puerta</w:t>
             </w:r>
+            <w:proofErr w:type="spellEnd"/>
           </w:p>
         </w:tc>
         <w:tc>
@@ -9379,12 +10135,14 @@
                 <w:lang w:val="es-CO"/>
               </w:rPr>
             </w:pPr>
+            <w:proofErr w:type="spellStart"/>
             <w:r>
               <w:rPr>
                 <w:lang w:val="es-CO"/>
               </w:rPr>
               <w:t>Entradas_Oportunas</w:t>
             </w:r>
+            <w:proofErr w:type="spellEnd"/>
           </w:p>
         </w:tc>
         <w:tc>
@@ -9438,12 +10196,14 @@
                 <w:lang w:val="es-CO"/>
               </w:rPr>
             </w:pPr>
+            <w:proofErr w:type="spellStart"/>
             <w:r>
               <w:rPr>
                 <w:lang w:val="es-CO"/>
               </w:rPr>
               <w:t>Porteria_Imbatida</w:t>
             </w:r>
+            <w:proofErr w:type="spellEnd"/>
           </w:p>
         </w:tc>
         <w:tc>
@@ -9563,7 +10323,23 @@
           <w:color w:val="000000"/>
           <w:lang w:val="es-CO"/>
         </w:rPr>
-        <w:t>: todo jugador pertenece a alguna de las cuatro subclases, acorde con su atributo Posicion.</w:t>
+        <w:t xml:space="preserve">: todo jugador pertenece a alguna de las cuatro subclases, acorde con su atributo </w:t>
+      </w:r>
+      <w:proofErr w:type="spellStart"/>
+      <w:r>
+        <w:rPr>
+          <w:color w:val="000000"/>
+          <w:lang w:val="es-CO"/>
+        </w:rPr>
+        <w:t>Posicion</w:t>
+      </w:r>
+      <w:proofErr w:type="spellEnd"/>
+      <w:r>
+        <w:rPr>
+          <w:color w:val="000000"/>
+          <w:lang w:val="es-CO"/>
+        </w:rPr>
+        <w:t>.</w:t>
       </w:r>
     </w:p>
     <w:p>
@@ -9589,6 +10365,7 @@
           <w:color w:val="000000"/>
           <w:lang w:val="es-CO"/>
         </w:rPr>
+        <w:lastRenderedPageBreak/>
         <w:t>Los atributos propios corresponden a estadísticas acumuladas por el jugador y solo tienen sentido para su posición.</w:t>
       </w:r>
     </w:p>
@@ -9662,7 +10439,6 @@
           <w:color w:val="000000"/>
           <w:lang w:val="es-CO"/>
         </w:rPr>
-        <w:lastRenderedPageBreak/>
         <w:t>OCURRIR (PARTICIPACIÓN 1</w:t>
       </w:r>
       <w:proofErr w:type="gramStart"/>
@@ -10039,6 +10815,7 @@
               </w:rPr>
               <w:t xml:space="preserve">Se elimina. La posición queda como atributo </w:t>
             </w:r>
+            <w:proofErr w:type="spellStart"/>
             <w:r>
               <w:rPr>
                 <w:rFonts w:ascii="Consolas" w:eastAsia="Consolas" w:hAnsi="Consolas" w:cs="Consolas"/>
@@ -10049,6 +10826,7 @@
               </w:rPr>
               <w:t>Posicion</w:t>
             </w:r>
+            <w:proofErr w:type="spellEnd"/>
             <w:r>
               <w:rPr>
                 <w:lang w:val="es-CO"/>
@@ -10093,7 +10871,49 @@
               <w:rPr>
                 <w:lang w:val="es-CO"/>
               </w:rPr>
-              <w:t>Atributos propios de las subclases (Tiros_Puerta, Pases, Entradas_Oportunas, Porteria_Imbatida)</w:t>
+              <w:t>Atributos propios de las subclases (</w:t>
+            </w:r>
+            <w:proofErr w:type="spellStart"/>
+            <w:r>
+              <w:rPr>
+                <w:lang w:val="es-CO"/>
+              </w:rPr>
+              <w:t>Tiros_Puerta</w:t>
+            </w:r>
+            <w:proofErr w:type="spellEnd"/>
+            <w:r>
+              <w:rPr>
+                <w:lang w:val="es-CO"/>
+              </w:rPr>
+              <w:t xml:space="preserve">, Pases, </w:t>
+            </w:r>
+            <w:proofErr w:type="spellStart"/>
+            <w:r>
+              <w:rPr>
+                <w:lang w:val="es-CO"/>
+              </w:rPr>
+              <w:t>Entradas_Oportunas</w:t>
+            </w:r>
+            <w:proofErr w:type="spellEnd"/>
+            <w:r>
+              <w:rPr>
+                <w:lang w:val="es-CO"/>
+              </w:rPr>
+              <w:t xml:space="preserve">, </w:t>
+            </w:r>
+            <w:proofErr w:type="spellStart"/>
+            <w:r>
+              <w:rPr>
+                <w:lang w:val="es-CO"/>
+              </w:rPr>
+              <w:t>Porteria_Imbatida</w:t>
+            </w:r>
+            <w:proofErr w:type="spellEnd"/>
+            <w:r>
+              <w:rPr>
+                <w:lang w:val="es-CO"/>
+              </w:rPr>
+              <w:t>)</w:t>
             </w:r>
           </w:p>
         </w:tc>
@@ -10171,7 +10991,35 @@
               <w:rPr>
                 <w:lang w:val="es-CO"/>
               </w:rPr>
-              <w:t>Se convierte en la entidad PARTICIPACION (id_participacion, Titular, Minutos_jugados), conectada por REALIZAR (JUGADOR 1</w:t>
+              <w:t>Se convierte en la entidad PARTICIPACION (</w:t>
+            </w:r>
+            <w:proofErr w:type="spellStart"/>
+            <w:r>
+              <w:rPr>
+                <w:lang w:val="es-CO"/>
+              </w:rPr>
+              <w:t>id_participacion</w:t>
+            </w:r>
+            <w:proofErr w:type="spellEnd"/>
+            <w:r>
+              <w:rPr>
+                <w:lang w:val="es-CO"/>
+              </w:rPr>
+              <w:t xml:space="preserve">, Titular, </w:t>
+            </w:r>
+            <w:proofErr w:type="spellStart"/>
+            <w:r>
+              <w:rPr>
+                <w:lang w:val="es-CO"/>
+              </w:rPr>
+              <w:t>Minutos_jugados</w:t>
+            </w:r>
+            <w:proofErr w:type="spellEnd"/>
+            <w:r>
+              <w:rPr>
+                <w:lang w:val="es-CO"/>
+              </w:rPr>
+              <w:t>), conectada por REALIZAR (JUGADOR 1</w:t>
             </w:r>
             <w:proofErr w:type="gramStart"/>
             <w:r>
@@ -10298,6 +11146,7 @@
               <w:rPr>
                 <w:lang w:val="es-CO"/>
               </w:rPr>
+              <w:lastRenderedPageBreak/>
               <w:t>OCURRIR (agregación – TARJETA) y RECIBIR (JUGADOR – TARJETA)</w:t>
             </w:r>
           </w:p>
@@ -10371,7 +11220,21 @@
               <w:rPr>
                 <w:lang w:val="es-CO"/>
               </w:rPr>
-              <w:t>Atributos multivaluado, compuestos y derivados; entidades débiles</w:t>
+              <w:t xml:space="preserve">Atributos </w:t>
+            </w:r>
+            <w:proofErr w:type="spellStart"/>
+            <w:r>
+              <w:rPr>
+                <w:lang w:val="es-CO"/>
+              </w:rPr>
+              <w:t>multivaluado</w:t>
+            </w:r>
+            <w:proofErr w:type="spellEnd"/>
+            <w:r>
+              <w:rPr>
+                <w:lang w:val="es-CO"/>
+              </w:rPr>
+              <w:t>, compuestos y derivados; entidades débiles</w:t>
             </w:r>
           </w:p>
         </w:tc>
@@ -10409,7 +11272,21 @@
               <w:rPr>
                 <w:lang w:val="es-CO"/>
               </w:rPr>
-              <w:t>Pertenecen al MER básico de Chen.</w:t>
+              <w:t xml:space="preserve">Pertenecen al MER básico de </w:t>
+            </w:r>
+            <w:proofErr w:type="spellStart"/>
+            <w:r>
+              <w:rPr>
+                <w:lang w:val="es-CO"/>
+              </w:rPr>
+              <w:t>Chen</w:t>
+            </w:r>
+            <w:proofErr w:type="spellEnd"/>
+            <w:r>
+              <w:rPr>
+                <w:lang w:val="es-CO"/>
+              </w:rPr>
+              <w:t>.</w:t>
             </w:r>
           </w:p>
         </w:tc>
@@ -10431,7 +11308,6 @@
           <w:color w:val="F27900"/>
           <w:lang w:val="es-CO"/>
         </w:rPr>
-        <w:lastRenderedPageBreak/>
         <w:t>9. Supuestos para el paso al modelo relacional</w:t>
       </w:r>
     </w:p>
@@ -10527,7 +11403,23 @@
           <w:color w:val="000000"/>
           <w:lang w:val="es-CO"/>
         </w:rPr>
-        <w:t xml:space="preserve">El atributo multivaluado </w:t>
+        <w:t xml:space="preserve">El atributo </w:t>
+      </w:r>
+      <w:proofErr w:type="spellStart"/>
+      <w:r>
+        <w:rPr>
+          <w:color w:val="000000"/>
+          <w:lang w:val="es-CO"/>
+        </w:rPr>
+        <w:t>multivaluado</w:t>
+      </w:r>
+      <w:proofErr w:type="spellEnd"/>
+      <w:r>
+        <w:rPr>
+          <w:color w:val="000000"/>
+          <w:lang w:val="es-CO"/>
+        </w:rPr>
+        <w:t xml:space="preserve"> </w:t>
       </w:r>
       <w:r>
         <w:rPr>
@@ -10545,7 +11437,23 @@
           <w:color w:val="000000"/>
           <w:lang w:val="es-CO"/>
         </w:rPr>
-        <w:t xml:space="preserve"> de EQUIPO se convierte en la tabla EQUIPO_COLOR, con llave compuesta (id_equipo, color).</w:t>
+        <w:t xml:space="preserve"> de EQUIPO se convierte en la tabla EQUIPO_COLOR, con llave compuesta (</w:t>
+      </w:r>
+      <w:proofErr w:type="spellStart"/>
+      <w:r>
+        <w:rPr>
+          <w:color w:val="000000"/>
+          <w:lang w:val="es-CO"/>
+        </w:rPr>
+        <w:t>id_equipo</w:t>
+      </w:r>
+      <w:proofErr w:type="spellEnd"/>
+      <w:r>
+        <w:rPr>
+          <w:color w:val="000000"/>
+          <w:lang w:val="es-CO"/>
+        </w:rPr>
+        <w:t>, color).</w:t>
       </w:r>
     </w:p>
     <w:p>
@@ -10592,6 +11500,7 @@
         </w:rPr>
         <w:t xml:space="preserve">, </w:t>
       </w:r>
+      <w:proofErr w:type="spellStart"/>
       <w:r>
         <w:rPr>
           <w:rFonts w:eastAsia="Consolas"/>
@@ -10603,6 +11512,7 @@
         </w:rPr>
         <w:t>Duracion_dias</w:t>
       </w:r>
+      <w:proofErr w:type="spellEnd"/>
       <w:r>
         <w:rPr>
           <w:color w:val="000000"/>
@@ -10651,7 +11561,103 @@
           <w:color w:val="000000"/>
           <w:lang w:val="es-CO"/>
         </w:rPr>
-        <w:t xml:space="preserve"> se resuelven con una llave foránea en la tabla del lado N (por ejemplo, id_sede en EQUIPO; id_torneo, id_estadio, id_local e id_visitante en PARTIDO). La relación 1:1 DIRIGIR se resuelve con la llave foránea id_tecnico en EQUIPO, con restricción UNIQUE para que un técnico no dirija más de un equipo.</w:t>
+        <w:t xml:space="preserve"> se resuelven con una llave foránea en la tabla del lado N (por ejemplo, </w:t>
+      </w:r>
+      <w:proofErr w:type="spellStart"/>
+      <w:r>
+        <w:rPr>
+          <w:color w:val="000000"/>
+          <w:lang w:val="es-CO"/>
+        </w:rPr>
+        <w:t>id_sede</w:t>
+      </w:r>
+      <w:proofErr w:type="spellEnd"/>
+      <w:r>
+        <w:rPr>
+          <w:color w:val="000000"/>
+          <w:lang w:val="es-CO"/>
+        </w:rPr>
+        <w:t xml:space="preserve"> en EQUIPO; </w:t>
+      </w:r>
+      <w:proofErr w:type="spellStart"/>
+      <w:r>
+        <w:rPr>
+          <w:color w:val="000000"/>
+          <w:lang w:val="es-CO"/>
+        </w:rPr>
+        <w:t>id_torneo</w:t>
+      </w:r>
+      <w:proofErr w:type="spellEnd"/>
+      <w:r>
+        <w:rPr>
+          <w:color w:val="000000"/>
+          <w:lang w:val="es-CO"/>
+        </w:rPr>
+        <w:t xml:space="preserve">, </w:t>
+      </w:r>
+      <w:proofErr w:type="spellStart"/>
+      <w:r>
+        <w:rPr>
+          <w:color w:val="000000"/>
+          <w:lang w:val="es-CO"/>
+        </w:rPr>
+        <w:t>id_estadio</w:t>
+      </w:r>
+      <w:proofErr w:type="spellEnd"/>
+      <w:r>
+        <w:rPr>
+          <w:color w:val="000000"/>
+          <w:lang w:val="es-CO"/>
+        </w:rPr>
+        <w:t xml:space="preserve">, </w:t>
+      </w:r>
+      <w:proofErr w:type="spellStart"/>
+      <w:r>
+        <w:rPr>
+          <w:color w:val="000000"/>
+          <w:lang w:val="es-CO"/>
+        </w:rPr>
+        <w:t>id_local</w:t>
+      </w:r>
+      <w:proofErr w:type="spellEnd"/>
+      <w:r>
+        <w:rPr>
+          <w:color w:val="000000"/>
+          <w:lang w:val="es-CO"/>
+        </w:rPr>
+        <w:t xml:space="preserve"> e </w:t>
+      </w:r>
+      <w:proofErr w:type="spellStart"/>
+      <w:r>
+        <w:rPr>
+          <w:color w:val="000000"/>
+          <w:lang w:val="es-CO"/>
+        </w:rPr>
+        <w:t>id_visitante</w:t>
+      </w:r>
+      <w:proofErr w:type="spellEnd"/>
+      <w:r>
+        <w:rPr>
+          <w:color w:val="000000"/>
+          <w:lang w:val="es-CO"/>
+        </w:rPr>
+        <w:t xml:space="preserve"> en PARTIDO). La relación 1:1 DIRIGIR se resuelve con la llave foránea </w:t>
+      </w:r>
+      <w:proofErr w:type="spellStart"/>
+      <w:r>
+        <w:rPr>
+          <w:color w:val="000000"/>
+          <w:lang w:val="es-CO"/>
+        </w:rPr>
+        <w:t>id_tecnico</w:t>
+      </w:r>
+      <w:proofErr w:type="spellEnd"/>
+      <w:r>
+        <w:rPr>
+          <w:color w:val="000000"/>
+          <w:lang w:val="es-CO"/>
+        </w:rPr>
+        <w:t xml:space="preserve"> en EQUIPO, con restricción UNIQUE para que un técnico no dirija más de un equipo.</w:t>
       </w:r>
     </w:p>
     <w:p>
@@ -10721,16 +11727,87 @@
           <w:color w:val="000000"/>
           <w:lang w:val="es-CO"/>
         </w:rPr>
-        <w:t>La relación ternaria</w:t>
-      </w:r>
-      <w:bookmarkStart w:id="0" w:name="_GoBack"/>
-      <w:bookmarkEnd w:id="0"/>
-      <w:r>
-        <w:rPr>
-          <w:color w:val="000000"/>
-          <w:lang w:val="es-CO"/>
-        </w:rPr>
-        <w:t xml:space="preserve"> INSCRIBIR se convierte en la tabla INSCRIPCION, con llave compuesta (id_equipo, id_torneo, id_jugador) y los atributos dorsal, fecha_inicio y fecha_fin.</w:t>
+        <w:t>La relación ternaria INSCRIBIR se convierte en la tabla INSCRIPCION, con llave compuesta (</w:t>
+      </w:r>
+      <w:proofErr w:type="spellStart"/>
+      <w:r>
+        <w:rPr>
+          <w:color w:val="000000"/>
+          <w:lang w:val="es-CO"/>
+        </w:rPr>
+        <w:t>id_equipo</w:t>
+      </w:r>
+      <w:proofErr w:type="spellEnd"/>
+      <w:r>
+        <w:rPr>
+          <w:color w:val="000000"/>
+          <w:lang w:val="es-CO"/>
+        </w:rPr>
+        <w:t xml:space="preserve">, </w:t>
+      </w:r>
+      <w:proofErr w:type="spellStart"/>
+      <w:r>
+        <w:rPr>
+          <w:color w:val="000000"/>
+          <w:lang w:val="es-CO"/>
+        </w:rPr>
+        <w:t>id_torneo</w:t>
+      </w:r>
+      <w:proofErr w:type="spellEnd"/>
+      <w:r>
+        <w:rPr>
+          <w:color w:val="000000"/>
+          <w:lang w:val="es-CO"/>
+        </w:rPr>
+        <w:t xml:space="preserve">, </w:t>
+      </w:r>
+      <w:proofErr w:type="spellStart"/>
+      <w:r>
+        <w:rPr>
+          <w:color w:val="000000"/>
+          <w:lang w:val="es-CO"/>
+        </w:rPr>
+        <w:t>id_jugador</w:t>
+      </w:r>
+      <w:proofErr w:type="spellEnd"/>
+      <w:r>
+        <w:rPr>
+          <w:color w:val="000000"/>
+          <w:lang w:val="es-CO"/>
+        </w:rPr>
+        <w:t xml:space="preserve">) y los atributos dorsal, </w:t>
+      </w:r>
+      <w:proofErr w:type="spellStart"/>
+      <w:r>
+        <w:rPr>
+          <w:color w:val="000000"/>
+          <w:lang w:val="es-CO"/>
+        </w:rPr>
+        <w:t>fecha_inicio</w:t>
+      </w:r>
+      <w:proofErr w:type="spellEnd"/>
+      <w:r>
+        <w:rPr>
+          <w:color w:val="000000"/>
+          <w:lang w:val="es-CO"/>
+        </w:rPr>
+        <w:t xml:space="preserve"> y </w:t>
+      </w:r>
+      <w:proofErr w:type="spellStart"/>
+      <w:r>
+        <w:rPr>
+          <w:color w:val="000000"/>
+          <w:lang w:val="es-CO"/>
+        </w:rPr>
+        <w:t>fecha_fin</w:t>
+      </w:r>
+      <w:proofErr w:type="spellEnd"/>
+      <w:r>
+        <w:rPr>
+          <w:color w:val="000000"/>
+          <w:lang w:val="es-CO"/>
+        </w:rPr>
+        <w:t>.</w:t>
       </w:r>
     </w:p>
     <w:p>
@@ -10876,7 +11953,25 @@
           <w:color w:val="000000"/>
           <w:lang w:val="es-CO"/>
         </w:rPr>
-        <w:t>Integración con otras ligas, torneos internacionales, plataformas de streaming o redes sociales.</w:t>
+        <w:t xml:space="preserve">Integración con otras ligas, torneos internacionales, plataformas de </w:t>
+      </w:r>
+      <w:proofErr w:type="spellStart"/>
+      <w:r>
+        <w:rPr>
+          <w:rFonts w:asciiTheme="majorHAnsi" w:hAnsiTheme="majorHAnsi" w:cstheme="majorHAnsi"/>
+          <w:color w:val="000000"/>
+          <w:lang w:val="es-CO"/>
+        </w:rPr>
+        <w:t>streaming</w:t>
+      </w:r>
+      <w:proofErr w:type="spellEnd"/>
+      <w:r>
+        <w:rPr>
+          <w:rFonts w:asciiTheme="majorHAnsi" w:hAnsiTheme="majorHAnsi" w:cstheme="majorHAnsi"/>
+          <w:color w:val="000000"/>
+          <w:lang w:val="es-CO"/>
+        </w:rPr>
+        <w:t xml:space="preserve"> o redes sociales.</w:t>
       </w:r>
     </w:p>
     <w:p>

</xml_diff>